<commit_message>
Anonymise the company named in the checklist and acceptable use policy
Both documents were written for a real London SME property company. Remove its name
from the text and the file name, and describe it as a London SME property company in
the README. The name remains in earlier commits.

Co-Authored-By: Claude Sonnet 5.5 <noreply@anthropic.com>
</commit_message>
<xml_diff>
--- a/Draft Acceptable Use Policy.docx
+++ b/Draft Acceptable Use Policy.docx
@@ -93,7 +93,7 @@
           <w:szCs w:val="24"/>
           <w:rtl w:val="0"/>
         </w:rPr>
-        <w:t xml:space="preserve">This policy outlines the acceptable use of computer equipment, email, and internet access at Filey Properties. It is designed to protect our reputation, our clients' data, and our staff from legal and security risks.​</w:t>
+        <w:t>This policy outlines the acceptable use of computer equipment, email, and internet access at the company. It is designed to protect our reputation, our clients' data, and our staff from legal and security risks.​</w:t>
       </w:r>
     </w:p>
     <w:p>
@@ -637,16 +637,15 @@
           <w:szCs w:val="24"/>
           <w:rtl w:val="0"/>
         </w:rPr>
-        <w:t xml:space="preserve">Filey Properties</w:t>
-      </w:r>
-      <w:r>
-        <w:rPr>
-          <w:rFonts w:ascii="Roboto" w:cs="Roboto" w:eastAsia="Roboto" w:hAnsi="Roboto"/>
-          <w:sz w:val="24"/>
-          <w:szCs w:val="24"/>
-          <w:rtl w:val="0"/>
-        </w:rPr>
-        <w:t xml:space="preserve"> respects employee privacy but reserves the right to monitor systems and communications to ensure compliance with this policy, investigate security incidents, or comply with legal obligations.​</w:t>
+        <w:t>the company respects employee privacy but reserves the right to monitor systems and communications to ensure compliance with this policy, investigate security incidents, or comply with legal obligations.​</w:t>
+      </w:r>
+      <w:r>
+        <w:rPr>
+          <w:rFonts w:ascii="Roboto" w:cs="Roboto" w:eastAsia="Roboto" w:hAnsi="Roboto"/>
+          <w:sz w:val="24"/>
+          <w:szCs w:val="24"/>
+          <w:rtl w:val="0"/>
+        </w:rPr>
       </w:r>
     </w:p>
     <w:p>
@@ -726,12 +725,34 @@
       </w:r>
     </w:p>
     <w:sectPr>
+      <w:headerReference w:type="default" r:id="rId6"/>
+      <w:footerReference w:type="default" r:id="rId7"/>
       <w:pgSz w:h="16834" w:w="11909" w:orient="portrait"/>
       <w:pgMar w:bottom="1440" w:top="1440" w:left="1440" w:right="1440" w:header="720" w:footer="720"/>
       <w:pgNumType w:start="1"/>
     </w:sectPr>
   </w:body>
 </w:document>
+</file>
+
+<file path=word/footer1.xml><?xml version="1.0" encoding="utf-8"?>
+<w:ftr xmlns:m="http://schemas.openxmlformats.org/officeDocument/2006/math" xmlns:mc="http://schemas.openxmlformats.org/markup-compatibility/2006" xmlns:mo="http://schemas.microsoft.com/office/mac/office/2008/main" xmlns:mv="urn:schemas-microsoft-com:mac:vml" xmlns:o="urn:schemas-microsoft-com:office:office" xmlns:r="http://schemas.openxmlformats.org/officeDocument/2006/relationships" xmlns:v="urn:schemas-microsoft-com:vml" xmlns:w10="urn:schemas-microsoft-com:office:word" xmlns:w14="http://schemas.microsoft.com/office/word/2010/wordml" xmlns:w="http://schemas.openxmlformats.org/wordprocessingml/2006/main" xmlns:wne="http://schemas.microsoft.com/office/word/2006/wordml" xmlns:wp14="http://schemas.microsoft.com/office/word/2010/wordprocessingDrawing" xmlns:wp="http://schemas.openxmlformats.org/drawingml/2006/wordprocessingDrawing" xmlns:wpc="http://schemas.microsoft.com/office/word/2010/wordprocessingCanvas" xmlns:wpg="http://schemas.microsoft.com/office/word/2010/wordprocessingGroup" xmlns:wpi="http://schemas.microsoft.com/office/word/2010/wordprocessingInk" xmlns:wps="http://schemas.microsoft.com/office/word/2010/wordprocessingShape" mc:Ignorable="w14 wp14">
+  <w:p>
+    <w:pPr>
+      <w:pStyle w:val="Footer"/>
+    </w:pPr>
+  </w:p>
+</w:ftr>
+</file>
+
+<file path=word/header1.xml><?xml version="1.0" encoding="utf-8"?>
+<w:hdr xmlns:m="http://schemas.openxmlformats.org/officeDocument/2006/math" xmlns:mc="http://schemas.openxmlformats.org/markup-compatibility/2006" xmlns:mo="http://schemas.microsoft.com/office/mac/office/2008/main" xmlns:mv="urn:schemas-microsoft-com:mac:vml" xmlns:o="urn:schemas-microsoft-com:office:office" xmlns:r="http://schemas.openxmlformats.org/officeDocument/2006/relationships" xmlns:v="urn:schemas-microsoft-com:vml" xmlns:w10="urn:schemas-microsoft-com:office:word" xmlns:w14="http://schemas.microsoft.com/office/word/2010/wordml" xmlns:w="http://schemas.openxmlformats.org/wordprocessingml/2006/main" xmlns:wne="http://schemas.microsoft.com/office/word/2006/wordml" xmlns:wp14="http://schemas.microsoft.com/office/word/2010/wordprocessingDrawing" xmlns:wp="http://schemas.openxmlformats.org/drawingml/2006/wordprocessingDrawing" xmlns:wpc="http://schemas.microsoft.com/office/word/2010/wordprocessingCanvas" xmlns:wpg="http://schemas.microsoft.com/office/word/2010/wordprocessingGroup" xmlns:wpi="http://schemas.microsoft.com/office/word/2010/wordprocessingInk" xmlns:wps="http://schemas.microsoft.com/office/word/2010/wordprocessingShape" mc:Ignorable="w14 wp14">
+  <w:p>
+    <w:pPr>
+      <w:pStyle w:val="Header"/>
+    </w:pPr>
+  </w:p>
+</w:hdr>
 </file>
 
 <file path=word/numbering.xml><?xml version="1.0" encoding="utf-8"?>

</xml_diff>